<commit_message>
docs: bring technical spec and deployment guides up to date
The artefacts/ removal and the move of the technical specification to docs/
landed in 0639525 together with the axios update; this commit updates the
moved documents.

- technical spec: attendees see meeting-detail action items read-only and can
  update the status of their assigned items; last updated 2026-10-14; docx
  and PDF regenerated
- deployment guide 1.2: axios ^1.20.0, spec path docs/technical-spec.pdf,
  testing report referenced from the v1.0.0 release package
- deployment guidelines: Silo instead of MinIO, workflow worker naming, AI
  required for the recording workflow, GPU overlay not validated

Co-Authored-By: Claude Opus 5.5 <noreply@anthropic.com>
</commit_message>
<xml_diff>
--- a/docs/technical-spec.docx
+++ b/docs/technical-spec.docx
@@ -25,7 +25,7 @@
           <w:color w:val="555555"/>
           <w:sz w:val="21"/>
         </w:rPr>
-        <w:t xml:space="preserve">Last updated: 2026-10-07</w:t>
+        <w:t xml:space="preserve">Last updated: 2026-10-14</w:t>
       </w:r>
     </w:p>
     <w:p>
@@ -529,7 +529,7 @@
               <w:rPr>
                 <w:sz w:val="17"/>
               </w:rPr>
-              <w:t>View meeting detail, access files/minutes, complete action items.</w:t>
+              <w:t>View meeting detail (action items read-only), access files/minutes, update the status of their assigned action items.</w:t>
             </w:r>
           </w:p>
         </w:tc>

</xml_diff>